<commit_message>
Updating design examples with fresh content
</commit_message>
<xml_diff>
--- a/resume/JeremyMParkerResume.docx
+++ b/resume/JeremyMParkerResume.docx
@@ -984,6 +984,14 @@
         </w:rPr>
         <w:t>, GraphQL</w:t>
       </w:r>
+      <w:r>
+        <w:rPr>
+          <w:rFonts w:ascii="Sitka Display" w:hAnsi="Sitka Display"/>
+          <w:color w:val="111111"/>
+          <w:spacing w:val="5"/>
+        </w:rPr>
+        <w:t xml:space="preserve"> (federation architecture, schemas)</w:t>
+      </w:r>
     </w:p>
     <w:p>
       <w:pPr>
@@ -1324,7 +1332,23 @@
           <w:color w:val="111111"/>
           <w:spacing w:val="5"/>
         </w:rPr>
-        <w:t>Best Practices, Accessibility (WCAG 2.0 Level AA)</w:t>
+        <w:t>Best Practices, Accessibility (</w:t>
+      </w:r>
+      <w:r>
+        <w:rPr>
+          <w:rFonts w:ascii="Sitka Display" w:hAnsi="Sitka Display"/>
+          <w:color w:val="111111"/>
+          <w:spacing w:val="5"/>
+        </w:rPr>
+        <w:t>Section 508, WCAG 2.2</w:t>
+      </w:r>
+      <w:r>
+        <w:rPr>
+          <w:rFonts w:ascii="Sitka Display" w:hAnsi="Sitka Display"/>
+          <w:color w:val="111111"/>
+          <w:spacing w:val="5"/>
+        </w:rPr>
+        <w:t>)</w:t>
       </w:r>
     </w:p>
     <w:p>
@@ -8130,7 +8154,6 @@
   <w:style w:type="character" w:default="1" w:styleId="DefaultParagraphFont">
     <w:name w:val="Default Paragraph Font"/>
     <w:uiPriority w:val="1"/>
-    <w:semiHidden/>
     <w:unhideWhenUsed/>
   </w:style>
   <w:style w:type="table" w:default="1" w:styleId="TableNormal">

</xml_diff>